<commit_message>
Update CheatSheet and Finance External docs for kpi-tree-builder
- CheatSheet: added kpi-tree-builder row, count 23 -> 24
- Finance External: added kpi-tree-builder row, count 25 -> 26

Co-Authored-By: Claude Sonnet 4.6 <noreply@anthropic.com>
</commit_message>
<xml_diff>
--- a/docs/Claude_Skill_Library_External (Finance).docx
+++ b/docs/Claude_Skill_Library_External (Finance).docx
@@ -1590,6 +1590,116 @@
           </w:p>
         </w:tc>
       </w:tr>
+      <w:tr>
+        <w:tc>
+          <w:tcPr>
+            <w:tcW w:w="1200" w:type="dxa"/>
+            <w:tcBorders>
+              <w:top w:val="single" w:sz="4" w:space="0" w:color="DDDDDD"/>
+              <w:left w:val="single" w:sz="4" w:space="0" w:color="DDDDDD"/>
+              <w:bottom w:val="single" w:sz="4" w:space="0" w:color="DDDDDD"/>
+              <w:right w:val="single" w:sz="4" w:space="0" w:color="DDDDDD"/>
+            </w:tcBorders>
+            <w:shd w:val="clear" w:color="auto" w:fill="F2F2F2"/>
+            <w:tcMar>
+              <w:top w:w="80" w:type="dxa"/>
+              <w:left w:w="120" w:type="dxa"/>
+              <w:bottom w:w="80" w:type="dxa"/>
+              <w:right w:w="120" w:type="dxa"/>
+            </w:tcMar>
+          </w:tcPr>
+          <w:p>
+            <w:r>
+              <w:rPr>
+                <w:sz w:val="15"/>
+                <w:szCs w:val="15"/>
+              </w:rPr>
+              <w:t>2 -- Research</w:t>
+            </w:r>
+          </w:p>
+        </w:tc>
+        <w:tc>
+          <w:tcPr>
+            <w:tcW w:w="2400" w:type="dxa"/>
+            <w:tcBorders>
+              <w:top w:val="single" w:sz="4" w:space="0" w:color="DDDDDD"/>
+              <w:left w:val="single" w:sz="4" w:space="0" w:color="DDDDDD"/>
+              <w:bottom w:val="single" w:sz="4" w:space="0" w:color="DDDDDD"/>
+              <w:right w:val="single" w:sz="4" w:space="0" w:color="DDDDDD"/>
+            </w:tcBorders>
+            <w:shd w:val="clear" w:color="auto" w:fill="F2F2F2"/>
+            <w:tcMar>
+              <w:top w:w="80" w:type="dxa"/>
+              <w:left w:w="120" w:type="dxa"/>
+              <w:bottom w:w="80" w:type="dxa"/>
+              <w:right w:w="120" w:type="dxa"/>
+            </w:tcMar>
+          </w:tcPr>
+          <w:p>
+            <w:r>
+              <w:rPr>
+                <w:sz w:val="15"/>
+                <w:szCs w:val="15"/>
+              </w:rPr>
+              <w:t>kpi-tree-builder</w:t>
+            </w:r>
+          </w:p>
+        </w:tc>
+        <w:tc>
+          <w:tcPr>
+            <w:tcW w:w="4200" w:type="dxa"/>
+            <w:tcBorders>
+              <w:top w:val="single" w:sz="4" w:space="0" w:color="DDDDDD"/>
+              <w:left w:val="single" w:sz="4" w:space="0" w:color="DDDDDD"/>
+              <w:bottom w:val="single" w:sz="4" w:space="0" w:color="DDDDDD"/>
+              <w:right w:val="single" w:sz="4" w:space="0" w:color="DDDDDD"/>
+            </w:tcBorders>
+            <w:shd w:val="clear" w:color="auto" w:fill="F2F2F2"/>
+            <w:tcMar>
+              <w:top w:w="80" w:type="dxa"/>
+              <w:left w:w="120" w:type="dxa"/>
+              <w:bottom w:w="80" w:type="dxa"/>
+              <w:right w:w="120" w:type="dxa"/>
+            </w:tcMar>
+          </w:tcPr>
+          <w:p>
+            <w:r>
+              <w:rPr>
+                <w:sz w:val="15"/>
+                <w:szCs w:val="15"/>
+              </w:rPr>
+              <w:t>Decomposes a budget, forecast, or operating target into causal drivers and atomic inputs. Two modes: diligence (audit management budget credibility) and post-close (define tracking architecture). Produces KPI tree, driver dictionary, and tracking pack.</w:t>
+            </w:r>
+          </w:p>
+        </w:tc>
+        <w:tc>
+          <w:tcPr>
+            <w:tcW w:w="3000" w:type="dxa"/>
+            <w:tcBorders>
+              <w:top w:val="single" w:sz="4" w:space="0" w:color="DDDDDD"/>
+              <w:left w:val="single" w:sz="4" w:space="0" w:color="DDDDDD"/>
+              <w:bottom w:val="single" w:sz="4" w:space="0" w:color="DDDDDD"/>
+              <w:right w:val="single" w:sz="4" w:space="0" w:color="DDDDDD"/>
+            </w:tcBorders>
+            <w:shd w:val="clear" w:color="auto" w:fill="F2F2F2"/>
+            <w:tcMar>
+              <w:top w:w="80" w:type="dxa"/>
+              <w:left w:w="120" w:type="dxa"/>
+              <w:bottom w:w="80" w:type="dxa"/>
+              <w:right w:w="120" w:type="dxa"/>
+            </w:tcMar>
+          </w:tcPr>
+          <w:p>
+            <w:r>
+              <w:rPr>
+                <w:sz w:val="15"/>
+                <w:szCs w:val="15"/>
+              </w:rPr>
+              <w:t>driver-tree, ntb-diligence</w:t>
+            </w:r>
+          </w:p>
+        </w:tc>
+      </w:tr>
     </w:tbl>
     <w:p>
       <w:pPr>
@@ -1769,7 +1879,7 @@
         <w:rPr>
           <w:rFonts w:ascii="Wix Madefor Display SemiBold" w:eastAsia="Wix Madefor Display SemiBold" w:hAnsi="Wix Madefor Display SemiBold" w:cs="Wix Madefor Display SemiBold"/>
         </w:rPr>
-        <w:t>25 skills across four layers. Skills marked * have been updated in April 2026.</w:t>
+        <w:t>26 skills across four layers. Skills marked * have been updated in April 2026.</w:t>
       </w:r>
     </w:p>
     <w:p>

</xml_diff>

<commit_message>
@ Update Word docs and CheatSheet: add gtm-metrics-analyzer, remove deleted skills
- Claude_Skills_CheatSheet.docx: remove saas-revenue-growth-metrics row, add
  gtm-metrics-analyzer after kpi-tree-builder, update count to 21 skills
- Claude_Skill_Library_External (Finance).docx: remove saas-revenue-growth-metrics
  and saas-economics-efficiency-metrics rows, add gtm-metrics-analyzer, update
  count to 25 skills, clean Layer 2 summary row
- gtm-metrics-analyzer/SKILL.md: remove deleted saas skills from architecture
  diagram and when-to-use table
- Add patch_cheatsheet.py and patch_finance_lib.py as maintenance utilities

Co-Authored-By: Claude Sonnet 4.6 <noreply@anthropic.com>
@
</commit_message>
<xml_diff>
--- a/docs/Claude_Skill_Library_External (Finance).docx
+++ b/docs/Claude_Skill_Library_External (Finance).docx
@@ -1,36 +1,5 @@
 
-<file path=docProps\app.xml><?xml version="1.0" encoding="utf-8"?>
-<Properties xmlns="http://schemas.openxmlformats.org/officeDocument/2006/extended-properties" xmlns:vt="http://schemas.openxmlformats.org/officeDocument/2006/docPropsVTypes">
-  <Template>Normal</Template>
-  <TotalTime>1</TotalTime>
-  <Pages>15</Pages>
-  <Words>5731</Words>
-  <Characters>32668</Characters>
-  <Application>Microsoft Office Word</Application>
-  <DocSecurity>0</DocSecurity>
-  <Lines>272</Lines>
-  <Paragraphs>76</Paragraphs>
-  <ScaleCrop>false</ScaleCrop>
-  <Company/>
-  <LinksUpToDate>false</LinksUpToDate>
-  <CharactersWithSpaces>38323</CharactersWithSpaces>
-  <SharedDoc>false</SharedDoc>
-  <HyperlinksChanged>false</HyperlinksChanged>
-  <AppVersion>16.0000</AppVersion>
-</Properties>
-</file>
-
-<file path=docProps\core.xml><?xml version="1.0" encoding="utf-8"?>
-<cp:coreProperties xmlns:cp="http://schemas.openxmlformats.org/package/2006/metadata/core-properties" xmlns:dc="http://purl.org/dc/elements/1.1/" xmlns:dcterms="http://purl.org/dc/terms/" xmlns:dcmitype="http://purl.org/dc/dcmitype/" xmlns:xsi="http://www.w3.org/2001/XMLSchema-instance">
-  <dc:creator>Un-named</dc:creator>
-  <cp:lastModifiedBy>Ian Lawrence</cp:lastModifiedBy>
-  <cp:revision>2</cp:revision>
-  <dcterms:created xsi:type="dcterms:W3CDTF">2026-04-21T00:18:00Z</dcterms:created>
-  <dcterms:modified xsi:type="dcterms:W3CDTF">2026-04-21T00:18:00Z</dcterms:modified>
-</cp:coreProperties>
-</file>
-
-<file path=word\document.xml><?xml version="1.0" encoding="utf-8"?>
+<file path=word/document.xml><?xml version="1.0" encoding="utf-8"?>
 <w:document xmlns:wpc="http://schemas.microsoft.com/office/word/2010/wordprocessingCanvas" xmlns:cx="http://schemas.microsoft.com/office/drawing/2014/chartex" xmlns:cx1="http://schemas.microsoft.com/office/drawing/2015/9/8/chartex" xmlns:cx2="http://schemas.microsoft.com/office/drawing/2015/10/21/chartex" xmlns:cx3="http://schemas.microsoft.com/office/drawing/2016/5/9/chartex" xmlns:cx4="http://schemas.microsoft.com/office/drawing/2016/5/10/chartex" xmlns:cx5="http://schemas.microsoft.com/office/drawing/2016/5/11/chartex" xmlns:cx6="http://schemas.microsoft.com/office/drawing/2016/5/12/chartex" xmlns:cx7="http://schemas.microsoft.com/office/drawing/2016/5/13/chartex" xmlns:cx8="http://schemas.microsoft.com/office/drawing/2016/5/14/chartex" xmlns:mc="http://schemas.openxmlformats.org/markup-compatibility/2006" xmlns:aink="http://schemas.microsoft.com/office/drawing/2016/ink" xmlns:am3d="http://schemas.microsoft.com/office/drawing/2017/model3d" xmlns:o="urn:schemas-microsoft-com:office:office" xmlns:oel="http://schemas.microsoft.com/office/2019/extlst" xmlns:r="http://schemas.openxmlformats.org/officeDocument/2006/relationships" xmlns:m="http://schemas.openxmlformats.org/officeDocument/2006/math" xmlns:v="urn:schemas-microsoft-com:vml" xmlns:wp14="http://schemas.microsoft.com/office/word/2010/wordprocessingDrawing" xmlns:wp="http://schemas.openxmlformats.org/drawingml/2006/wordprocessingDrawing" xmlns:w10="urn:schemas-microsoft-com:office:word" xmlns:w="http://schemas.openxmlformats.org/wordprocessingml/2006/main" xmlns:w14="http://schemas.microsoft.com/office/word/2010/wordml" xmlns:w15="http://schemas.microsoft.com/office/word/2012/wordml" xmlns:w16cex="http://schemas.microsoft.com/office/word/2018/wordml/cex" xmlns:w16cid="http://schemas.microsoft.com/office/word/2016/wordml/cid" xmlns:w16="http://schemas.microsoft.com/office/word/2018/wordml" xmlns:w16du="http://schemas.microsoft.com/office/word/2023/wordml/word16du" xmlns:w16sdtdh="http://schemas.microsoft.com/office/word/2020/wordml/sdtdatahash" xmlns:w16sdtfl="http://schemas.microsoft.com/office/word/2024/wordml/sdtformatlock" xmlns:w16se="http://schemas.microsoft.com/office/word/2015/wordml/symex" xmlns:wpg="http://schemas.microsoft.com/office/word/2010/wordprocessingGroup" xmlns:wpi="http://schemas.microsoft.com/office/word/2010/wordprocessingInk" xmlns:wne="http://schemas.microsoft.com/office/word/2006/wordml" xmlns:wps="http://schemas.microsoft.com/office/word/2010/wordprocessingShape" mc:Ignorable="w14 w15 w16se w16cid w16 w16cex w16sdtdh w16sdtfl w16du wp14">
   <w:body>
     <w:p>
@@ -1421,7 +1390,7 @@
                 <w:sz w:val="15"/>
                 <w:szCs w:val="15"/>
               </w:rPr>
-              <w:t>saas-revenue-growth-metrics</w:t>
+              <w:t>kpi-tree-builder</w:t>
             </w:r>
           </w:p>
         </w:tc>
@@ -1448,7 +1417,7 @@
                 <w:sz w:val="15"/>
                 <w:szCs w:val="15"/>
               </w:rPr>
-              <w:t>Revenue, retention, NRR/GRR, ARR growth, churn, expansion, and logo retention. Metric definitions, calculation methodology, and benchmark ranges by stage and sector.</w:t>
+              <w:t>Decomposes a budget, forecast, or operating target into causal drivers and atomic inputs. Two modes: diligence (audit management budget credibility) and post-close (define tracking architecture). Produces KPI tree, driver dictionary, and tracking pack.</w:t>
             </w:r>
           </w:p>
         </w:tc>
@@ -1475,7 +1444,7 @@
                 <w:sz w:val="15"/>
                 <w:szCs w:val="15"/>
               </w:rPr>
-              <w:t>None -- leaf skill</w:t>
+              <w:t>driver-tree, ntb-diligence</w:t>
             </w:r>
           </w:p>
         </w:tc>
@@ -1490,7 +1459,7 @@
               <w:bottom w:val="single" w:sz="4" w:space="0" w:color="DDDDDD"/>
               <w:right w:val="single" w:sz="4" w:space="0" w:color="DDDDDD"/>
             </w:tcBorders>
-            <w:shd w:val="clear" w:color="auto" w:fill="FFFFFF"/>
+            <w:shd w:val="clear" w:color="auto" w:fill="F2F2F2"/>
             <w:tcMar>
               <w:top w:w="80" w:type="dxa"/>
               <w:left w:w="120" w:type="dxa"/>
@@ -1517,21 +1486,21 @@
               <w:bottom w:val="single" w:sz="4" w:space="0" w:color="DDDDDD"/>
               <w:right w:val="single" w:sz="4" w:space="0" w:color="DDDDDD"/>
             </w:tcBorders>
-            <w:shd w:val="clear" w:color="auto" w:fill="FFFFFF"/>
-            <w:tcMar>
-              <w:top w:w="80" w:type="dxa"/>
-              <w:left w:w="120" w:type="dxa"/>
-              <w:bottom w:w="80" w:type="dxa"/>
-              <w:right w:w="120" w:type="dxa"/>
-            </w:tcMar>
-          </w:tcPr>
-          <w:p>
-            <w:r>
-              <w:rPr>
-                <w:sz w:val="15"/>
-                <w:szCs w:val="15"/>
-              </w:rPr>
-              <w:t>saas-economics-efficiency-metrics</w:t>
+            <w:shd w:val="clear" w:color="auto" w:fill="F2F2F2"/>
+            <w:tcMar>
+              <w:top w:w="80" w:type="dxa"/>
+              <w:left w:w="120" w:type="dxa"/>
+              <w:bottom w:w="80" w:type="dxa"/>
+              <w:right w:w="120" w:type="dxa"/>
+            </w:tcMar>
+          </w:tcPr>
+          <w:p>
+            <w:r>
+              <w:rPr>
+                <w:sz w:val="15"/>
+                <w:szCs w:val="15"/>
+              </w:rPr>
+              <w:t>gtm-metrics-analyzer</w:t>
             </w:r>
           </w:p>
         </w:tc>
@@ -1544,21 +1513,21 @@
               <w:bottom w:val="single" w:sz="4" w:space="0" w:color="DDDDDD"/>
               <w:right w:val="single" w:sz="4" w:space="0" w:color="DDDDDD"/>
             </w:tcBorders>
-            <w:shd w:val="clear" w:color="auto" w:fill="FFFFFF"/>
-            <w:tcMar>
-              <w:top w:w="80" w:type="dxa"/>
-              <w:left w:w="120" w:type="dxa"/>
-              <w:bottom w:w="80" w:type="dxa"/>
-              <w:right w:w="120" w:type="dxa"/>
-            </w:tcMar>
-          </w:tcPr>
-          <w:p>
-            <w:r>
-              <w:rPr>
-                <w:sz w:val="15"/>
-                <w:szCs w:val="15"/>
-              </w:rPr>
-              <w:t>CAC, LTV, payback period, Rule of 40, burn multiple, and capital efficiency ratios. Benchmarking against SaaS peers.</w:t>
+            <w:shd w:val="clear" w:color="auto" w:fill="F2F2F2"/>
+            <w:tcMar>
+              <w:top w:w="80" w:type="dxa"/>
+              <w:left w:w="120" w:type="dxa"/>
+              <w:bottom w:w="80" w:type="dxa"/>
+              <w:right w:w="120" w:type="dxa"/>
+            </w:tcMar>
+          </w:tcPr>
+          <w:p>
+            <w:r>
+              <w:rPr>
+                <w:sz w:val="15"/>
+                <w:szCs w:val="15"/>
+              </w:rPr>
+              <w:t>Builds a 4-tab GTM diagnostic workbook from uploaded source files. Calculates 48 metrics across 6 families: ARR funnel, pipeline, retention, efficiency &amp; economics, team &amp; productivity, fiscal maturity. Separates provided inputs from derived outputs. Requires Excel 365/2019+.</w:t>
             </w:r>
           </w:p>
         </w:tc>
@@ -1571,131 +1540,21 @@
               <w:bottom w:val="single" w:sz="4" w:space="0" w:color="DDDDDD"/>
               <w:right w:val="single" w:sz="4" w:space="0" w:color="DDDDDD"/>
             </w:tcBorders>
-            <w:shd w:val="clear" w:color="auto" w:fill="FFFFFF"/>
-            <w:tcMar>
-              <w:top w:w="80" w:type="dxa"/>
-              <w:left w:w="120" w:type="dxa"/>
-              <w:bottom w:w="80" w:type="dxa"/>
-              <w:right w:w="120" w:type="dxa"/>
-            </w:tcMar>
-          </w:tcPr>
-          <w:p>
-            <w:r>
-              <w:rPr>
-                <w:sz w:val="15"/>
-                <w:szCs w:val="15"/>
-              </w:rPr>
-              <w:t>None -- leaf skill</w:t>
-            </w:r>
-          </w:p>
-        </w:tc>
-      </w:tr>
-      <w:tr>
-        <w:tc>
-          <w:tcPr>
-            <w:tcW w:w="1200" w:type="dxa"/>
-            <w:tcBorders>
-              <w:top w:val="single" w:sz="4" w:space="0" w:color="DDDDDD"/>
-              <w:left w:val="single" w:sz="4" w:space="0" w:color="DDDDDD"/>
-              <w:bottom w:val="single" w:sz="4" w:space="0" w:color="DDDDDD"/>
-              <w:right w:val="single" w:sz="4" w:space="0" w:color="DDDDDD"/>
-            </w:tcBorders>
-            <w:shd w:val="clear" w:color="auto" w:fill="F2F2F2"/>
-            <w:tcMar>
-              <w:top w:w="80" w:type="dxa"/>
-              <w:left w:w="120" w:type="dxa"/>
-              <w:bottom w:w="80" w:type="dxa"/>
-              <w:right w:w="120" w:type="dxa"/>
-            </w:tcMar>
-          </w:tcPr>
-          <w:p>
-            <w:r>
-              <w:rPr>
-                <w:sz w:val="15"/>
-                <w:szCs w:val="15"/>
-              </w:rPr>
-              <w:t>2 -- Research</w:t>
-            </w:r>
-          </w:p>
-        </w:tc>
-        <w:tc>
-          <w:tcPr>
-            <w:tcW w:w="2400" w:type="dxa"/>
-            <w:tcBorders>
-              <w:top w:val="single" w:sz="4" w:space="0" w:color="DDDDDD"/>
-              <w:left w:val="single" w:sz="4" w:space="0" w:color="DDDDDD"/>
-              <w:bottom w:val="single" w:sz="4" w:space="0" w:color="DDDDDD"/>
-              <w:right w:val="single" w:sz="4" w:space="0" w:color="DDDDDD"/>
-            </w:tcBorders>
-            <w:shd w:val="clear" w:color="auto" w:fill="F2F2F2"/>
-            <w:tcMar>
-              <w:top w:w="80" w:type="dxa"/>
-              <w:left w:w="120" w:type="dxa"/>
-              <w:bottom w:w="80" w:type="dxa"/>
-              <w:right w:w="120" w:type="dxa"/>
-            </w:tcMar>
-          </w:tcPr>
-          <w:p>
-            <w:r>
-              <w:rPr>
-                <w:sz w:val="15"/>
-                <w:szCs w:val="15"/>
-              </w:rPr>
-              <w:t>kpi-tree-builder</w:t>
-            </w:r>
-          </w:p>
-        </w:tc>
-        <w:tc>
-          <w:tcPr>
-            <w:tcW w:w="4200" w:type="dxa"/>
-            <w:tcBorders>
-              <w:top w:val="single" w:sz="4" w:space="0" w:color="DDDDDD"/>
-              <w:left w:val="single" w:sz="4" w:space="0" w:color="DDDDDD"/>
-              <w:bottom w:val="single" w:sz="4" w:space="0" w:color="DDDDDD"/>
-              <w:right w:val="single" w:sz="4" w:space="0" w:color="DDDDDD"/>
-            </w:tcBorders>
-            <w:shd w:val="clear" w:color="auto" w:fill="F2F2F2"/>
-            <w:tcMar>
-              <w:top w:w="80" w:type="dxa"/>
-              <w:left w:w="120" w:type="dxa"/>
-              <w:bottom w:w="80" w:type="dxa"/>
-              <w:right w:w="120" w:type="dxa"/>
-            </w:tcMar>
-          </w:tcPr>
-          <w:p>
-            <w:r>
-              <w:rPr>
-                <w:sz w:val="15"/>
-                <w:szCs w:val="15"/>
-              </w:rPr>
-              <w:t>Decomposes a budget, forecast, or operating target into causal drivers and atomic inputs. Two modes: diligence (audit management budget credibility) and post-close (define tracking architecture). Produces KPI tree, driver dictionary, and tracking pack.</w:t>
-            </w:r>
-          </w:p>
-        </w:tc>
-        <w:tc>
-          <w:tcPr>
-            <w:tcW w:w="3000" w:type="dxa"/>
-            <w:tcBorders>
-              <w:top w:val="single" w:sz="4" w:space="0" w:color="DDDDDD"/>
-              <w:left w:val="single" w:sz="4" w:space="0" w:color="DDDDDD"/>
-              <w:bottom w:val="single" w:sz="4" w:space="0" w:color="DDDDDD"/>
-              <w:right w:val="single" w:sz="4" w:space="0" w:color="DDDDDD"/>
-            </w:tcBorders>
-            <w:shd w:val="clear" w:color="auto" w:fill="F2F2F2"/>
-            <w:tcMar>
-              <w:top w:w="80" w:type="dxa"/>
-              <w:left w:w="120" w:type="dxa"/>
-              <w:bottom w:w="80" w:type="dxa"/>
-              <w:right w:w="120" w:type="dxa"/>
-            </w:tcMar>
-          </w:tcPr>
-          <w:p>
-            <w:r>
-              <w:rPr>
-                <w:sz w:val="15"/>
-                <w:szCs w:val="15"/>
-              </w:rPr>
-              <w:t>driver-tree, ntb-diligence</w:t>
+            <w:shd w:val="clear" w:color="auto" w:fill="F2F2F2"/>
+            <w:tcMar>
+              <w:top w:w="80" w:type="dxa"/>
+              <w:left w:w="120" w:type="dxa"/>
+              <w:bottom w:w="80" w:type="dxa"/>
+              <w:right w:w="120" w:type="dxa"/>
+            </w:tcMar>
+          </w:tcPr>
+          <w:p>
+            <w:r>
+              <w:rPr>
+                <w:sz w:val="15"/>
+                <w:szCs w:val="15"/>
+              </w:rPr>
+              <w:t>financial-model-builder, driver-tree, ntb-diligence, kpi-tree-builder</w:t>
             </w:r>
           </w:p>
         </w:tc>
@@ -1879,7 +1738,7 @@
         <w:rPr>
           <w:rFonts w:ascii="Wix Madefor Display SemiBold" w:eastAsia="Wix Madefor Display SemiBold" w:hAnsi="Wix Madefor Display SemiBold" w:cs="Wix Madefor Display SemiBold"/>
         </w:rPr>
-        <w:t>26 skills across four layers. Skills marked * have been updated in April 2026.</w:t>
+        <w:t>25 skills across four layers. Skills marked * have been updated in April 2026.</w:t>
       </w:r>
     </w:p>
     <w:p>
@@ -18788,7 +18647,7 @@
 </w:document>
 </file>
 
-<file path=word\endnotes.xml><?xml version="1.0" encoding="utf-8"?>
+<file path=word/endnotes.xml><?xml version="1.0" encoding="utf-8"?>
 <w:endnotes xmlns:wpc="http://schemas.microsoft.com/office/word/2010/wordprocessingCanvas" xmlns:cx="http://schemas.microsoft.com/office/drawing/2014/chartex" xmlns:cx1="http://schemas.microsoft.com/office/drawing/2015/9/8/chartex" xmlns:cx2="http://schemas.microsoft.com/office/drawing/2015/10/21/chartex" xmlns:cx3="http://schemas.microsoft.com/office/drawing/2016/5/9/chartex" xmlns:cx4="http://schemas.microsoft.com/office/drawing/2016/5/10/chartex" xmlns:cx5="http://schemas.microsoft.com/office/drawing/2016/5/11/chartex" xmlns:cx6="http://schemas.microsoft.com/office/drawing/2016/5/12/chartex" xmlns:cx7="http://schemas.microsoft.com/office/drawing/2016/5/13/chartex" xmlns:cx8="http://schemas.microsoft.com/office/drawing/2016/5/14/chartex" xmlns:mc="http://schemas.openxmlformats.org/markup-compatibility/2006" xmlns:aink="http://schemas.microsoft.com/office/drawing/2016/ink" xmlns:am3d="http://schemas.microsoft.com/office/drawing/2017/model3d" xmlns:o="urn:schemas-microsoft-com:office:office" xmlns:oel="http://schemas.microsoft.com/office/2019/extlst" xmlns:r="http://schemas.openxmlformats.org/officeDocument/2006/relationships" xmlns:m="http://schemas.openxmlformats.org/officeDocument/2006/math" xmlns:v="urn:schemas-microsoft-com:vml" xmlns:wp14="http://schemas.microsoft.com/office/word/2010/wordprocessingDrawing" xmlns:wp="http://schemas.openxmlformats.org/drawingml/2006/wordprocessingDrawing" xmlns:w10="urn:schemas-microsoft-com:office:word" xmlns:w="http://schemas.openxmlformats.org/wordprocessingml/2006/main" xmlns:w14="http://schemas.microsoft.com/office/word/2010/wordml" xmlns:w15="http://schemas.microsoft.com/office/word/2012/wordml" xmlns:w16cex="http://schemas.microsoft.com/office/word/2018/wordml/cex" xmlns:w16cid="http://schemas.microsoft.com/office/word/2016/wordml/cid" xmlns:w16="http://schemas.microsoft.com/office/word/2018/wordml" xmlns:w16du="http://schemas.microsoft.com/office/word/2023/wordml/word16du" xmlns:w16sdtdh="http://schemas.microsoft.com/office/word/2020/wordml/sdtdatahash" xmlns:w16sdtfl="http://schemas.microsoft.com/office/word/2024/wordml/sdtformatlock" xmlns:w16se="http://schemas.microsoft.com/office/word/2015/wordml/symex" xmlns:wpg="http://schemas.microsoft.com/office/word/2010/wordprocessingGroup" xmlns:wpi="http://schemas.microsoft.com/office/word/2010/wordprocessingInk" xmlns:wne="http://schemas.microsoft.com/office/word/2006/wordml" xmlns:wps="http://schemas.microsoft.com/office/word/2010/wordprocessingShape" mc:Ignorable="w14 w15 w16se w16cid w16 w16cex w16sdtdh w16sdtfl w16du wp14">
   <w:endnote w:type="separator" w:id="-1">
     <w:p>
@@ -18807,45 +18666,7 @@
 </w:endnotes>
 </file>
 
-<file path=word\fontTable.xml><?xml version="1.0" encoding="utf-8"?>
-<w:fonts xmlns:mc="http://schemas.openxmlformats.org/markup-compatibility/2006" xmlns:r="http://schemas.openxmlformats.org/officeDocument/2006/relationships" xmlns:w="http://schemas.openxmlformats.org/wordprocessingml/2006/main" xmlns:w14="http://schemas.microsoft.com/office/word/2010/wordml" xmlns:w15="http://schemas.microsoft.com/office/word/2012/wordml" xmlns:w16cex="http://schemas.microsoft.com/office/word/2018/wordml/cex" xmlns:w16cid="http://schemas.microsoft.com/office/word/2016/wordml/cid" xmlns:w16="http://schemas.microsoft.com/office/word/2018/wordml" xmlns:w16du="http://schemas.microsoft.com/office/word/2023/wordml/word16du" xmlns:w16sdtdh="http://schemas.microsoft.com/office/word/2020/wordml/sdtdatahash" xmlns:w16sdtfl="http://schemas.microsoft.com/office/word/2024/wordml/sdtformatlock" xmlns:w16se="http://schemas.microsoft.com/office/word/2015/wordml/symex" mc:Ignorable="w14 w15 w16se w16cid w16 w16cex w16sdtdh w16sdtfl w16du">
-  <w:font w:name="Wix Madefor Display">
-    <w:panose1 w:val="020B0503020203020203"/>
-    <w:charset w:val="00"/>
-    <w:family w:val="swiss"/>
-    <w:pitch w:val="variable"/>
-    <w:sig w:usb0="A000026F" w:usb1="0000A06B" w:usb2="00000008" w:usb3="00000000" w:csb0="00000197" w:csb1="00000000"/>
-  </w:font>
-  <w:font w:name="Times New Roman">
-    <w:panose1 w:val="02020603050405020304"/>
-    <w:charset w:val="00"/>
-    <w:family w:val="roman"/>
-    <w:pitch w:val="variable"/>
-    <w:sig w:usb0="E0002EFF" w:usb1="C000785B" w:usb2="00000009" w:usb3="00000000" w:csb0="000001FF" w:csb1="00000000"/>
-  </w:font>
-  <w:font w:name="Wix Madefor Display SemiBold">
-    <w:panose1 w:val="020B0503020203020203"/>
-    <w:charset w:val="00"/>
-    <w:family w:val="swiss"/>
-    <w:pitch w:val="variable"/>
-    <w:sig w:usb0="A000026F" w:usb1="0000A06B" w:usb2="00000008" w:usb3="00000000" w:csb0="00000197" w:csb1="00000000"/>
-  </w:font>
-  <w:font w:name="Aptos Display">
-    <w:charset w:val="00"/>
-    <w:family w:val="swiss"/>
-    <w:pitch w:val="variable"/>
-    <w:sig w:usb0="20000287" w:usb1="00000003" w:usb2="00000000" w:usb3="00000000" w:csb0="0000019F" w:csb1="00000000"/>
-  </w:font>
-  <w:font w:name="Aptos">
-    <w:charset w:val="00"/>
-    <w:family w:val="swiss"/>
-    <w:pitch w:val="variable"/>
-    <w:sig w:usb0="20000287" w:usb1="00000003" w:usb2="00000000" w:usb3="00000000" w:csb0="0000019F" w:csb1="00000000"/>
-  </w:font>
-</w:fonts>
-</file>
-
-<file path=word\footer1.xml><?xml version="1.0" encoding="utf-8"?>
+<file path=word/footer1.xml><?xml version="1.0" encoding="utf-8"?>
 <w:ftr xmlns:wpc="http://schemas.microsoft.com/office/word/2010/wordprocessingCanvas" xmlns:cx="http://schemas.microsoft.com/office/drawing/2014/chartex" xmlns:cx1="http://schemas.microsoft.com/office/drawing/2015/9/8/chartex" xmlns:cx2="http://schemas.microsoft.com/office/drawing/2015/10/21/chartex" xmlns:cx3="http://schemas.microsoft.com/office/drawing/2016/5/9/chartex" xmlns:cx4="http://schemas.microsoft.com/office/drawing/2016/5/10/chartex" xmlns:cx5="http://schemas.microsoft.com/office/drawing/2016/5/11/chartex" xmlns:cx6="http://schemas.microsoft.com/office/drawing/2016/5/12/chartex" xmlns:cx7="http://schemas.microsoft.com/office/drawing/2016/5/13/chartex" xmlns:cx8="http://schemas.microsoft.com/office/drawing/2016/5/14/chartex" xmlns:mc="http://schemas.openxmlformats.org/markup-compatibility/2006" xmlns:aink="http://schemas.microsoft.com/office/drawing/2016/ink" xmlns:am3d="http://schemas.microsoft.com/office/drawing/2017/model3d" xmlns:o="urn:schemas-microsoft-com:office:office" xmlns:oel="http://schemas.microsoft.com/office/2019/extlst" xmlns:r="http://schemas.openxmlformats.org/officeDocument/2006/relationships" xmlns:m="http://schemas.openxmlformats.org/officeDocument/2006/math" xmlns:v="urn:schemas-microsoft-com:vml" xmlns:wp14="http://schemas.microsoft.com/office/word/2010/wordprocessingDrawing" xmlns:wp="http://schemas.openxmlformats.org/drawingml/2006/wordprocessingDrawing" xmlns:w10="urn:schemas-microsoft-com:office:word" xmlns:w="http://schemas.openxmlformats.org/wordprocessingml/2006/main" xmlns:w14="http://schemas.microsoft.com/office/word/2010/wordml" xmlns:w15="http://schemas.microsoft.com/office/word/2012/wordml" xmlns:w16cex="http://schemas.microsoft.com/office/word/2018/wordml/cex" xmlns:w16cid="http://schemas.microsoft.com/office/word/2016/wordml/cid" xmlns:w16="http://schemas.microsoft.com/office/word/2018/wordml" xmlns:w16du="http://schemas.microsoft.com/office/word/2023/wordml/word16du" xmlns:w16sdtdh="http://schemas.microsoft.com/office/word/2020/wordml/sdtdatahash" xmlns:w16sdtfl="http://schemas.microsoft.com/office/word/2024/wordml/sdtformatlock" xmlns:w16se="http://schemas.microsoft.com/office/word/2015/wordml/symex" xmlns:wpg="http://schemas.microsoft.com/office/word/2010/wordprocessingGroup" xmlns:wpi="http://schemas.microsoft.com/office/word/2010/wordprocessingInk" xmlns:wne="http://schemas.microsoft.com/office/word/2006/wordml" xmlns:wps="http://schemas.microsoft.com/office/word/2010/wordprocessingShape" mc:Ignorable="w14 w15 w16se w16cid w16 w16cex w16sdtdh w16sdtfl w16du wp14">
   <w:p>
     <w:pPr>
@@ -18855,7 +18676,7 @@
 </w:ftr>
 </file>
 
-<file path=word\footer2.xml><?xml version="1.0" encoding="utf-8"?>
+<file path=word/footer2.xml><?xml version="1.0" encoding="utf-8"?>
 <w:ftr xmlns:wpc="http://schemas.microsoft.com/office/word/2010/wordprocessingCanvas" xmlns:cx="http://schemas.microsoft.com/office/drawing/2014/chartex" xmlns:cx1="http://schemas.microsoft.com/office/drawing/2015/9/8/chartex" xmlns:cx2="http://schemas.microsoft.com/office/drawing/2015/10/21/chartex" xmlns:cx3="http://schemas.microsoft.com/office/drawing/2016/5/9/chartex" xmlns:cx4="http://schemas.microsoft.com/office/drawing/2016/5/10/chartex" xmlns:cx5="http://schemas.microsoft.com/office/drawing/2016/5/11/chartex" xmlns:cx6="http://schemas.microsoft.com/office/drawing/2016/5/12/chartex" xmlns:cx7="http://schemas.microsoft.com/office/drawing/2016/5/13/chartex" xmlns:cx8="http://schemas.microsoft.com/office/drawing/2016/5/14/chartex" xmlns:mc="http://schemas.openxmlformats.org/markup-compatibility/2006" xmlns:aink="http://schemas.microsoft.com/office/drawing/2016/ink" xmlns:am3d="http://schemas.microsoft.com/office/drawing/2017/model3d" xmlns:o="urn:schemas-microsoft-com:office:office" xmlns:oel="http://schemas.microsoft.com/office/2019/extlst" xmlns:r="http://schemas.openxmlformats.org/officeDocument/2006/relationships" xmlns:m="http://schemas.openxmlformats.org/officeDocument/2006/math" xmlns:v="urn:schemas-microsoft-com:vml" xmlns:wp14="http://schemas.microsoft.com/office/word/2010/wordprocessingDrawing" xmlns:wp="http://schemas.openxmlformats.org/drawingml/2006/wordprocessingDrawing" xmlns:w10="urn:schemas-microsoft-com:office:word" xmlns:w="http://schemas.openxmlformats.org/wordprocessingml/2006/main" xmlns:w14="http://schemas.microsoft.com/office/word/2010/wordml" xmlns:w15="http://schemas.microsoft.com/office/word/2012/wordml" xmlns:w16cex="http://schemas.microsoft.com/office/word/2018/wordml/cex" xmlns:w16cid="http://schemas.microsoft.com/office/word/2016/wordml/cid" xmlns:w16="http://schemas.microsoft.com/office/word/2018/wordml" xmlns:w16du="http://schemas.microsoft.com/office/word/2023/wordml/word16du" xmlns:w16sdtdh="http://schemas.microsoft.com/office/word/2020/wordml/sdtdatahash" xmlns:w16sdtfl="http://schemas.microsoft.com/office/word/2024/wordml/sdtformatlock" xmlns:w16se="http://schemas.microsoft.com/office/word/2015/wordml/symex" xmlns:wpg="http://schemas.microsoft.com/office/word/2010/wordprocessingGroup" xmlns:wpi="http://schemas.microsoft.com/office/word/2010/wordprocessingInk" xmlns:wne="http://schemas.microsoft.com/office/word/2006/wordml" xmlns:wps="http://schemas.microsoft.com/office/word/2010/wordprocessingShape" mc:Ignorable="w14 w15 w16se w16cid w16 w16cex w16sdtdh w16sdtfl w16du wp14">
   <w:p>
     <w:pPr>
@@ -18985,7 +18806,7 @@
 </w:ftr>
 </file>
 
-<file path=word\footer3.xml><?xml version="1.0" encoding="utf-8"?>
+<file path=word/footer3.xml><?xml version="1.0" encoding="utf-8"?>
 <w:ftr xmlns:wpc="http://schemas.microsoft.com/office/word/2010/wordprocessingCanvas" xmlns:cx="http://schemas.microsoft.com/office/drawing/2014/chartex" xmlns:cx1="http://schemas.microsoft.com/office/drawing/2015/9/8/chartex" xmlns:cx2="http://schemas.microsoft.com/office/drawing/2015/10/21/chartex" xmlns:cx3="http://schemas.microsoft.com/office/drawing/2016/5/9/chartex" xmlns:cx4="http://schemas.microsoft.com/office/drawing/2016/5/10/chartex" xmlns:cx5="http://schemas.microsoft.com/office/drawing/2016/5/11/chartex" xmlns:cx6="http://schemas.microsoft.com/office/drawing/2016/5/12/chartex" xmlns:cx7="http://schemas.microsoft.com/office/drawing/2016/5/13/chartex" xmlns:cx8="http://schemas.microsoft.com/office/drawing/2016/5/14/chartex" xmlns:mc="http://schemas.openxmlformats.org/markup-compatibility/2006" xmlns:aink="http://schemas.microsoft.com/office/drawing/2016/ink" xmlns:am3d="http://schemas.microsoft.com/office/drawing/2017/model3d" xmlns:o="urn:schemas-microsoft-com:office:office" xmlns:oel="http://schemas.microsoft.com/office/2019/extlst" xmlns:r="http://schemas.openxmlformats.org/officeDocument/2006/relationships" xmlns:m="http://schemas.openxmlformats.org/officeDocument/2006/math" xmlns:v="urn:schemas-microsoft-com:vml" xmlns:wp14="http://schemas.microsoft.com/office/word/2010/wordprocessingDrawing" xmlns:wp="http://schemas.openxmlformats.org/drawingml/2006/wordprocessingDrawing" xmlns:w10="urn:schemas-microsoft-com:office:word" xmlns:w="http://schemas.openxmlformats.org/wordprocessingml/2006/main" xmlns:w14="http://schemas.microsoft.com/office/word/2010/wordml" xmlns:w15="http://schemas.microsoft.com/office/word/2012/wordml" xmlns:w16cex="http://schemas.microsoft.com/office/word/2018/wordml/cex" xmlns:w16cid="http://schemas.microsoft.com/office/word/2016/wordml/cid" xmlns:w16="http://schemas.microsoft.com/office/word/2018/wordml" xmlns:w16du="http://schemas.microsoft.com/office/word/2023/wordml/word16du" xmlns:w16sdtdh="http://schemas.microsoft.com/office/word/2020/wordml/sdtdatahash" xmlns:w16sdtfl="http://schemas.microsoft.com/office/word/2024/wordml/sdtformatlock" xmlns:w16se="http://schemas.microsoft.com/office/word/2015/wordml/symex" xmlns:wpg="http://schemas.microsoft.com/office/word/2010/wordprocessingGroup" xmlns:wpi="http://schemas.microsoft.com/office/word/2010/wordprocessingInk" xmlns:wne="http://schemas.microsoft.com/office/word/2006/wordml" xmlns:wps="http://schemas.microsoft.com/office/word/2010/wordprocessingShape" mc:Ignorable="w14 w15 w16se w16cid w16 w16cex w16sdtdh w16sdtfl w16du wp14">
   <w:p>
     <w:pPr>
@@ -18995,7 +18816,7 @@
 </w:ftr>
 </file>
 
-<file path=word\footnotes.xml><?xml version="1.0" encoding="utf-8"?>
+<file path=word/footnotes.xml><?xml version="1.0" encoding="utf-8"?>
 <w:footnotes xmlns:wpc="http://schemas.microsoft.com/office/word/2010/wordprocessingCanvas" xmlns:cx="http://schemas.microsoft.com/office/drawing/2014/chartex" xmlns:cx1="http://schemas.microsoft.com/office/drawing/2015/9/8/chartex" xmlns:cx2="http://schemas.microsoft.com/office/drawing/2015/10/21/chartex" xmlns:cx3="http://schemas.microsoft.com/office/drawing/2016/5/9/chartex" xmlns:cx4="http://schemas.microsoft.com/office/drawing/2016/5/10/chartex" xmlns:cx5="http://schemas.microsoft.com/office/drawing/2016/5/11/chartex" xmlns:cx6="http://schemas.microsoft.com/office/drawing/2016/5/12/chartex" xmlns:cx7="http://schemas.microsoft.com/office/drawing/2016/5/13/chartex" xmlns:cx8="http://schemas.microsoft.com/office/drawing/2016/5/14/chartex" xmlns:mc="http://schemas.openxmlformats.org/markup-compatibility/2006" xmlns:aink="http://schemas.microsoft.com/office/drawing/2016/ink" xmlns:am3d="http://schemas.microsoft.com/office/drawing/2017/model3d" xmlns:o="urn:schemas-microsoft-com:office:office" xmlns:oel="http://schemas.microsoft.com/office/2019/extlst" xmlns:r="http://schemas.openxmlformats.org/officeDocument/2006/relationships" xmlns:m="http://schemas.openxmlformats.org/officeDocument/2006/math" xmlns:v="urn:schemas-microsoft-com:vml" xmlns:wp14="http://schemas.microsoft.com/office/word/2010/wordprocessingDrawing" xmlns:wp="http://schemas.openxmlformats.org/drawingml/2006/wordprocessingDrawing" xmlns:w10="urn:schemas-microsoft-com:office:word" xmlns:w="http://schemas.openxmlformats.org/wordprocessingml/2006/main" xmlns:w14="http://schemas.microsoft.com/office/word/2010/wordml" xmlns:w15="http://schemas.microsoft.com/office/word/2012/wordml" xmlns:w16cex="http://schemas.microsoft.com/office/word/2018/wordml/cex" xmlns:w16cid="http://schemas.microsoft.com/office/word/2016/wordml/cid" xmlns:w16="http://schemas.microsoft.com/office/word/2018/wordml" xmlns:w16du="http://schemas.microsoft.com/office/word/2023/wordml/word16du" xmlns:w16sdtdh="http://schemas.microsoft.com/office/word/2020/wordml/sdtdatahash" xmlns:w16sdtfl="http://schemas.microsoft.com/office/word/2024/wordml/sdtformatlock" xmlns:w16se="http://schemas.microsoft.com/office/word/2015/wordml/symex" xmlns:wpg="http://schemas.microsoft.com/office/word/2010/wordprocessingGroup" xmlns:wpi="http://schemas.microsoft.com/office/word/2010/wordprocessingInk" xmlns:wne="http://schemas.microsoft.com/office/word/2006/wordml" xmlns:wps="http://schemas.microsoft.com/office/word/2010/wordprocessingShape" mc:Ignorable="w14 w15 w16se w16cid w16 w16cex w16sdtdh w16sdtfl w16du wp14">
   <w:footnote w:type="separator" w:id="-1">
     <w:p>
@@ -19014,7 +18835,7 @@
 </w:footnotes>
 </file>
 
-<file path=word\header1.xml><?xml version="1.0" encoding="utf-8"?>
+<file path=word/header1.xml><?xml version="1.0" encoding="utf-8"?>
 <w:hdr xmlns:wpc="http://schemas.microsoft.com/office/word/2010/wordprocessingCanvas" xmlns:cx="http://schemas.microsoft.com/office/drawing/2014/chartex" xmlns:cx1="http://schemas.microsoft.com/office/drawing/2015/9/8/chartex" xmlns:cx2="http://schemas.microsoft.com/office/drawing/2015/10/21/chartex" xmlns:cx3="http://schemas.microsoft.com/office/drawing/2016/5/9/chartex" xmlns:cx4="http://schemas.microsoft.com/office/drawing/2016/5/10/chartex" xmlns:cx5="http://schemas.microsoft.com/office/drawing/2016/5/11/chartex" xmlns:cx6="http://schemas.microsoft.com/office/drawing/2016/5/12/chartex" xmlns:cx7="http://schemas.microsoft.com/office/drawing/2016/5/13/chartex" xmlns:cx8="http://schemas.microsoft.com/office/drawing/2016/5/14/chartex" xmlns:mc="http://schemas.openxmlformats.org/markup-compatibility/2006" xmlns:aink="http://schemas.microsoft.com/office/drawing/2016/ink" xmlns:am3d="http://schemas.microsoft.com/office/drawing/2017/model3d" xmlns:o="urn:schemas-microsoft-com:office:office" xmlns:oel="http://schemas.microsoft.com/office/2019/extlst" xmlns:r="http://schemas.openxmlformats.org/officeDocument/2006/relationships" xmlns:m="http://schemas.openxmlformats.org/officeDocument/2006/math" xmlns:v="urn:schemas-microsoft-com:vml" xmlns:wp14="http://schemas.microsoft.com/office/word/2010/wordprocessingDrawing" xmlns:wp="http://schemas.openxmlformats.org/drawingml/2006/wordprocessingDrawing" xmlns:w10="urn:schemas-microsoft-com:office:word" xmlns:w="http://schemas.openxmlformats.org/wordprocessingml/2006/main" xmlns:w14="http://schemas.microsoft.com/office/word/2010/wordml" xmlns:w15="http://schemas.microsoft.com/office/word/2012/wordml" xmlns:w16cex="http://schemas.microsoft.com/office/word/2018/wordml/cex" xmlns:w16cid="http://schemas.microsoft.com/office/word/2016/wordml/cid" xmlns:w16="http://schemas.microsoft.com/office/word/2018/wordml" xmlns:w16du="http://schemas.microsoft.com/office/word/2023/wordml/word16du" xmlns:w16sdtdh="http://schemas.microsoft.com/office/word/2020/wordml/sdtdatahash" xmlns:w16sdtfl="http://schemas.microsoft.com/office/word/2024/wordml/sdtformatlock" xmlns:w16se="http://schemas.microsoft.com/office/word/2015/wordml/symex" xmlns:wpg="http://schemas.microsoft.com/office/word/2010/wordprocessingGroup" xmlns:wpi="http://schemas.microsoft.com/office/word/2010/wordprocessingInk" xmlns:wne="http://schemas.microsoft.com/office/word/2006/wordml" xmlns:wps="http://schemas.microsoft.com/office/word/2010/wordprocessingShape" mc:Ignorable="w14 w15 w16se w16cid w16 w16cex w16sdtdh w16sdtfl w16du wp14">
   <w:p>
     <w:pPr>
@@ -19024,7 +18845,7 @@
 </w:hdr>
 </file>
 
-<file path=word\header2.xml><?xml version="1.0" encoding="utf-8"?>
+<file path=word/header2.xml><?xml version="1.0" encoding="utf-8"?>
 <w:hdr xmlns:wpc="http://schemas.microsoft.com/office/word/2010/wordprocessingCanvas" xmlns:cx="http://schemas.microsoft.com/office/drawing/2014/chartex" xmlns:cx1="http://schemas.microsoft.com/office/drawing/2015/9/8/chartex" xmlns:cx2="http://schemas.microsoft.com/office/drawing/2015/10/21/chartex" xmlns:cx3="http://schemas.microsoft.com/office/drawing/2016/5/9/chartex" xmlns:cx4="http://schemas.microsoft.com/office/drawing/2016/5/10/chartex" xmlns:cx5="http://schemas.microsoft.com/office/drawing/2016/5/11/chartex" xmlns:cx6="http://schemas.microsoft.com/office/drawing/2016/5/12/chartex" xmlns:cx7="http://schemas.microsoft.com/office/drawing/2016/5/13/chartex" xmlns:cx8="http://schemas.microsoft.com/office/drawing/2016/5/14/chartex" xmlns:mc="http://schemas.openxmlformats.org/markup-compatibility/2006" xmlns:aink="http://schemas.microsoft.com/office/drawing/2016/ink" xmlns:am3d="http://schemas.microsoft.com/office/drawing/2017/model3d" xmlns:o="urn:schemas-microsoft-com:office:office" xmlns:oel="http://schemas.microsoft.com/office/2019/extlst" xmlns:r="http://schemas.openxmlformats.org/officeDocument/2006/relationships" xmlns:m="http://schemas.openxmlformats.org/officeDocument/2006/math" xmlns:v="urn:schemas-microsoft-com:vml" xmlns:wp14="http://schemas.microsoft.com/office/word/2010/wordprocessingDrawing" xmlns:wp="http://schemas.openxmlformats.org/drawingml/2006/wordprocessingDrawing" xmlns:w10="urn:schemas-microsoft-com:office:word" xmlns:w="http://schemas.openxmlformats.org/wordprocessingml/2006/main" xmlns:w14="http://schemas.microsoft.com/office/word/2010/wordml" xmlns:w15="http://schemas.microsoft.com/office/word/2012/wordml" xmlns:w16cex="http://schemas.microsoft.com/office/word/2018/wordml/cex" xmlns:w16cid="http://schemas.microsoft.com/office/word/2016/wordml/cid" xmlns:w16="http://schemas.microsoft.com/office/word/2018/wordml" xmlns:w16du="http://schemas.microsoft.com/office/word/2023/wordml/word16du" xmlns:w16sdtdh="http://schemas.microsoft.com/office/word/2020/wordml/sdtdatahash" xmlns:w16sdtfl="http://schemas.microsoft.com/office/word/2024/wordml/sdtformatlock" xmlns:w16se="http://schemas.microsoft.com/office/word/2015/wordml/symex" xmlns:wpg="http://schemas.microsoft.com/office/word/2010/wordprocessingGroup" xmlns:wpi="http://schemas.microsoft.com/office/word/2010/wordprocessingInk" xmlns:wne="http://schemas.microsoft.com/office/word/2006/wordml" xmlns:wps="http://schemas.microsoft.com/office/word/2010/wordprocessingShape" mc:Ignorable="w14 w15 w16se w16cid w16 w16cex w16sdtdh w16sdtfl w16du wp14">
   <w:p>
     <w:pPr>
@@ -19233,7 +19054,7 @@
 </w:hdr>
 </file>
 
-<file path=word\header3.xml><?xml version="1.0" encoding="utf-8"?>
+<file path=word/header3.xml><?xml version="1.0" encoding="utf-8"?>
 <w:hdr xmlns:wpc="http://schemas.microsoft.com/office/word/2010/wordprocessingCanvas" xmlns:cx="http://schemas.microsoft.com/office/drawing/2014/chartex" xmlns:cx1="http://schemas.microsoft.com/office/drawing/2015/9/8/chartex" xmlns:cx2="http://schemas.microsoft.com/office/drawing/2015/10/21/chartex" xmlns:cx3="http://schemas.microsoft.com/office/drawing/2016/5/9/chartex" xmlns:cx4="http://schemas.microsoft.com/office/drawing/2016/5/10/chartex" xmlns:cx5="http://schemas.microsoft.com/office/drawing/2016/5/11/chartex" xmlns:cx6="http://schemas.microsoft.com/office/drawing/2016/5/12/chartex" xmlns:cx7="http://schemas.microsoft.com/office/drawing/2016/5/13/chartex" xmlns:cx8="http://schemas.microsoft.com/office/drawing/2016/5/14/chartex" xmlns:mc="http://schemas.openxmlformats.org/markup-compatibility/2006" xmlns:aink="http://schemas.microsoft.com/office/drawing/2016/ink" xmlns:am3d="http://schemas.microsoft.com/office/drawing/2017/model3d" xmlns:o="urn:schemas-microsoft-com:office:office" xmlns:oel="http://schemas.microsoft.com/office/2019/extlst" xmlns:r="http://schemas.openxmlformats.org/officeDocument/2006/relationships" xmlns:m="http://schemas.openxmlformats.org/officeDocument/2006/math" xmlns:v="urn:schemas-microsoft-com:vml" xmlns:wp14="http://schemas.microsoft.com/office/word/2010/wordprocessingDrawing" xmlns:wp="http://schemas.openxmlformats.org/drawingml/2006/wordprocessingDrawing" xmlns:w10="urn:schemas-microsoft-com:office:word" xmlns:w="http://schemas.openxmlformats.org/wordprocessingml/2006/main" xmlns:w14="http://schemas.microsoft.com/office/word/2010/wordml" xmlns:w15="http://schemas.microsoft.com/office/word/2012/wordml" xmlns:w16cex="http://schemas.microsoft.com/office/word/2018/wordml/cex" xmlns:w16cid="http://schemas.microsoft.com/office/word/2016/wordml/cid" xmlns:w16="http://schemas.microsoft.com/office/word/2018/wordml" xmlns:w16du="http://schemas.microsoft.com/office/word/2023/wordml/word16du" xmlns:w16sdtdh="http://schemas.microsoft.com/office/word/2020/wordml/sdtdatahash" xmlns:w16sdtfl="http://schemas.microsoft.com/office/word/2024/wordml/sdtformatlock" xmlns:w16se="http://schemas.microsoft.com/office/word/2015/wordml/symex" xmlns:wpg="http://schemas.microsoft.com/office/word/2010/wordprocessingGroup" xmlns:wpi="http://schemas.microsoft.com/office/word/2010/wordprocessingInk" xmlns:wne="http://schemas.microsoft.com/office/word/2006/wordml" xmlns:wps="http://schemas.microsoft.com/office/word/2010/wordprocessingShape" mc:Ignorable="w14 w15 w16se w16cid w16 w16cex w16sdtdh w16sdtfl w16du wp14">
   <w:p>
     <w:pPr>
@@ -19243,7 +19064,7 @@
 </w:hdr>
 </file>
 
-<file path=word\numbering.xml><?xml version="1.0" encoding="utf-8"?>
+<file path=word/numbering.xml><?xml version="1.0" encoding="utf-8"?>
 <w:numbering xmlns:wpc="http://schemas.microsoft.com/office/word/2010/wordprocessingCanvas" xmlns:cx="http://schemas.microsoft.com/office/drawing/2014/chartex" xmlns:cx1="http://schemas.microsoft.com/office/drawing/2015/9/8/chartex" xmlns:cx2="http://schemas.microsoft.com/office/drawing/2015/10/21/chartex" xmlns:cx3="http://schemas.microsoft.com/office/drawing/2016/5/9/chartex" xmlns:cx4="http://schemas.microsoft.com/office/drawing/2016/5/10/chartex" xmlns:cx5="http://schemas.microsoft.com/office/drawing/2016/5/11/chartex" xmlns:cx6="http://schemas.microsoft.com/office/drawing/2016/5/12/chartex" xmlns:cx7="http://schemas.microsoft.com/office/drawing/2016/5/13/chartex" xmlns:cx8="http://schemas.microsoft.com/office/drawing/2016/5/14/chartex" xmlns:mc="http://schemas.openxmlformats.org/markup-compatibility/2006" xmlns:aink="http://schemas.microsoft.com/office/drawing/2016/ink" xmlns:am3d="http://schemas.microsoft.com/office/drawing/2017/model3d" xmlns:o="urn:schemas-microsoft-com:office:office" xmlns:oel="http://schemas.microsoft.com/office/2019/extlst" xmlns:r="http://schemas.openxmlformats.org/officeDocument/2006/relationships" xmlns:m="http://schemas.openxmlformats.org/officeDocument/2006/math" xmlns:v="urn:schemas-microsoft-com:vml" xmlns:wp14="http://schemas.microsoft.com/office/word/2010/wordprocessingDrawing" xmlns:wp="http://schemas.openxmlformats.org/drawingml/2006/wordprocessingDrawing" xmlns:w10="urn:schemas-microsoft-com:office:word" xmlns:w="http://schemas.openxmlformats.org/wordprocessingml/2006/main" xmlns:w14="http://schemas.microsoft.com/office/word/2010/wordml" xmlns:w15="http://schemas.microsoft.com/office/word/2012/wordml" xmlns:w16cex="http://schemas.microsoft.com/office/word/2018/wordml/cex" xmlns:w16cid="http://schemas.microsoft.com/office/word/2016/wordml/cid" xmlns:w16="http://schemas.microsoft.com/office/word/2018/wordml" xmlns:w16du="http://schemas.microsoft.com/office/word/2023/wordml/word16du" xmlns:w16sdtdh="http://schemas.microsoft.com/office/word/2020/wordml/sdtdatahash" xmlns:w16sdtfl="http://schemas.microsoft.com/office/word/2024/wordml/sdtformatlock" xmlns:w16se="http://schemas.microsoft.com/office/word/2015/wordml/symex" xmlns:wpg="http://schemas.microsoft.com/office/word/2010/wordprocessingGroup" xmlns:wpi="http://schemas.microsoft.com/office/word/2010/wordprocessingInk" xmlns:wne="http://schemas.microsoft.com/office/word/2006/wordml" xmlns:wps="http://schemas.microsoft.com/office/word/2010/wordprocessingShape" mc:Ignorable="w14 w15 w16se w16cid w16 w16cex w16sdtdh w16sdtfl w16du wp14">
   <w:abstractNum w:abstractNumId="0" w15:restartNumberingAfterBreak="0">
     <w:nsid w:val="751B64B3"/>
@@ -19404,108 +19225,7 @@
 </w:numbering>
 </file>
 
-<file path=word\settings.xml><?xml version="1.0" encoding="utf-8"?>
-<w:settings xmlns:mc="http://schemas.openxmlformats.org/markup-compatibility/2006" xmlns:o="urn:schemas-microsoft-com:office:office" xmlns:r="http://schemas.openxmlformats.org/officeDocument/2006/relationships" xmlns:m="http://schemas.openxmlformats.org/officeDocument/2006/math" xmlns:v="urn:schemas-microsoft-com:vml" xmlns:w10="urn:schemas-microsoft-com:office:word" xmlns:w="http://schemas.openxmlformats.org/wordprocessingml/2006/main" xmlns:w14="http://schemas.microsoft.com/office/word/2010/wordml" xmlns:w15="http://schemas.microsoft.com/office/word/2012/wordml" xmlns:w16cex="http://schemas.microsoft.com/office/word/2018/wordml/cex" xmlns:w16cid="http://schemas.microsoft.com/office/word/2016/wordml/cid" xmlns:w16="http://schemas.microsoft.com/office/word/2018/wordml" xmlns:w16du="http://schemas.microsoft.com/office/word/2023/wordml/word16du" xmlns:w16sdtdh="http://schemas.microsoft.com/office/word/2020/wordml/sdtdatahash" xmlns:w16sdtfl="http://schemas.microsoft.com/office/word/2024/wordml/sdtformatlock" xmlns:w16se="http://schemas.microsoft.com/office/word/2015/wordml/symex" xmlns:sl="http://schemas.openxmlformats.org/schemaLibrary/2006/main" mc:Ignorable="w14 w15 w16se w16cid w16 w16cex w16sdtdh w16sdtfl w16du">
-  <w:zoom w:percent="120"/>
-  <w:displayBackgroundShape/>
-  <w:proofState w:spelling="clean" w:grammar="clean"/>
-  <w:defaultTabStop w:val="720"/>
-  <w:characterSpacingControl w:val="doNotCompress"/>
-  <w:hdrShapeDefaults>
-    <o:shapedefaults v:ext="edit" spidmax="2050"/>
-  </w:hdrShapeDefaults>
-  <w:footnotePr>
-    <w:footnote w:id="-1"/>
-    <w:footnote w:id="0"/>
-  </w:footnotePr>
-  <w:endnotePr>
-    <w:endnote w:id="-1"/>
-    <w:endnote w:id="0"/>
-  </w:endnotePr>
-  <w:compat>
-    <w:compatSetting w:name="compatibilityMode" w:uri="http://schemas.microsoft.com/office/word" w:val="15"/>
-    <w:compatSetting w:name="overrideTableStyleFontSizeAndJustification" w:uri="http://schemas.microsoft.com/office/word" w:val="1"/>
-    <w:compatSetting w:name="enableOpenTypeFeatures" w:uri="http://schemas.microsoft.com/office/word" w:val="1"/>
-    <w:compatSetting w:name="doNotFlipMirrorIndents" w:uri="http://schemas.microsoft.com/office/word" w:val="1"/>
-    <w:compatSetting w:name="differentiateMultirowTableHeaders" w:uri="http://schemas.microsoft.com/office/word" w:val="1"/>
-    <w:compatSetting w:name="useWord2013TrackBottomHyphenation" w:uri="http://schemas.microsoft.com/office/word" w:val="1"/>
-  </w:compat>
-  <w:rsids>
-    <w:rsidRoot w:val="00E75EB5"/>
-    <w:rsid w:val="00050060"/>
-    <w:rsid w:val="00146114"/>
-    <w:rsid w:val="001556A8"/>
-    <w:rsid w:val="001D2E3D"/>
-    <w:rsid w:val="00207BC7"/>
-    <w:rsid w:val="0026672A"/>
-    <w:rsid w:val="00423C0F"/>
-    <w:rsid w:val="004746B8"/>
-    <w:rsid w:val="005171C6"/>
-    <w:rsid w:val="00564750"/>
-    <w:rsid w:val="005816A9"/>
-    <w:rsid w:val="00586B51"/>
-    <w:rsid w:val="006524CF"/>
-    <w:rsid w:val="006A2EB8"/>
-    <w:rsid w:val="006D6244"/>
-    <w:rsid w:val="006E6474"/>
-    <w:rsid w:val="00783DBA"/>
-    <w:rsid w:val="007B1D94"/>
-    <w:rsid w:val="007D5819"/>
-    <w:rsid w:val="00862586"/>
-    <w:rsid w:val="0088608B"/>
-    <w:rsid w:val="008A1888"/>
-    <w:rsid w:val="008F07D1"/>
-    <w:rsid w:val="00977318"/>
-    <w:rsid w:val="009A470B"/>
-    <w:rsid w:val="00A115D9"/>
-    <w:rsid w:val="00A44481"/>
-    <w:rsid w:val="00AB0322"/>
-    <w:rsid w:val="00B32BF9"/>
-    <w:rsid w:val="00B5237E"/>
-    <w:rsid w:val="00B764A1"/>
-    <w:rsid w:val="00C110CC"/>
-    <w:rsid w:val="00C17F8E"/>
-    <w:rsid w:val="00C546EC"/>
-    <w:rsid w:val="00CC23AE"/>
-    <w:rsid w:val="00DC2D6E"/>
-    <w:rsid w:val="00E6093F"/>
-    <w:rsid w:val="00E75EB5"/>
-    <w:rsid w:val="00E9721E"/>
-    <w:rsid w:val="00F05061"/>
-    <w:rsid w:val="00F24ADD"/>
-    <w:rsid w:val="00FB7A42"/>
-    <w:rsid w:val="00FD0617"/>
-    <w:rsid w:val="00FD7B06"/>
-  </w:rsids>
-  <m:mathPr>
-    <m:mathFont m:val="Cambria Math"/>
-    <m:brkBin m:val="before"/>
-    <m:brkBinSub m:val="--"/>
-    <m:smallFrac m:val="0"/>
-    <m:dispDef/>
-    <m:lMargin m:val="0"/>
-    <m:rMargin m:val="0"/>
-    <m:defJc m:val="centerGroup"/>
-    <m:wrapIndent m:val="1440"/>
-    <m:intLim m:val="subSup"/>
-    <m:naryLim m:val="undOvr"/>
-  </m:mathPr>
-  <w:themeFontLang w:val="en-US"/>
-  <w:clrSchemeMapping w:bg1="light1" w:t1="dark1" w:bg2="light2" w:t2="dark2" w:accent1="accent1" w:accent2="accent2" w:accent3="accent3" w:accent4="accent4" w:accent5="accent5" w:accent6="accent6" w:hyperlink="hyperlink" w:followedHyperlink="followedHyperlink"/>
-  <w:shapeDefaults>
-    <o:shapedefaults v:ext="edit" spidmax="2050"/>
-    <o:shapelayout v:ext="edit">
-      <o:idmap v:ext="edit" data="2"/>
-    </o:shapelayout>
-  </w:shapeDefaults>
-  <w:decimalSymbol w:val="."/>
-  <w:listSeparator w:val=","/>
-  <w14:docId w14:val="4FDE8DE4"/>
-  <w15:docId w15:val="{05BF0FD1-891B-480B-B82D-C438235D1D6A}"/>
-</w:settings>
-</file>
-
-<file path=word\styles.xml><?xml version="1.0" encoding="utf-8"?>
+<file path=word/styles.xml><?xml version="1.0" encoding="utf-8"?>
 <w:styles xmlns:mc="http://schemas.openxmlformats.org/markup-compatibility/2006" xmlns:r="http://schemas.openxmlformats.org/officeDocument/2006/relationships" xmlns:w="http://schemas.openxmlformats.org/wordprocessingml/2006/main" xmlns:w14="http://schemas.microsoft.com/office/word/2010/wordml" xmlns:w15="http://schemas.microsoft.com/office/word/2012/wordml" xmlns:w16cex="http://schemas.microsoft.com/office/word/2018/wordml/cex" xmlns:w16cid="http://schemas.microsoft.com/office/word/2016/wordml/cid" xmlns:w16="http://schemas.microsoft.com/office/word/2018/wordml" xmlns:w16du="http://schemas.microsoft.com/office/word/2023/wordml/word16du" xmlns:w16sdtdh="http://schemas.microsoft.com/office/word/2020/wordml/sdtdatahash" xmlns:w16sdtfl="http://schemas.microsoft.com/office/word/2024/wordml/sdtformatlock" xmlns:w16se="http://schemas.microsoft.com/office/word/2015/wordml/symex" mc:Ignorable="w14 w15 w16se w16cid w16 w16cex w16sdtdh w16sdtfl w16du">
   <w:docDefaults>
     <w:rPrDefault>
@@ -20121,7 +19841,7 @@
 </w:styles>
 </file>
 
-<file path=word\theme\theme1.xml><?xml version="1.0" encoding="utf-8"?>
+<file path=word/theme/theme1.xml><?xml version="1.0" encoding="utf-8"?>
 <a:theme xmlns:a="http://schemas.openxmlformats.org/drawingml/2006/main" name="Office Theme">
   <a:themeElements>
     <a:clrScheme name="Office">
@@ -20434,8 +20154,4 @@
     </a:ext>
   </a:extLst>
 </a:theme>
-</file>
-
-<file path=word\webSettings.xml><?xml version="1.0" encoding="utf-8"?>
-<w:webSettings xmlns:mc="http://schemas.openxmlformats.org/markup-compatibility/2006" xmlns:r="http://schemas.openxmlformats.org/officeDocument/2006/relationships" xmlns:w="http://schemas.openxmlformats.org/wordprocessingml/2006/main" xmlns:w14="http://schemas.microsoft.com/office/word/2010/wordml" xmlns:w15="http://schemas.microsoft.com/office/word/2012/wordml" xmlns:w16cex="http://schemas.microsoft.com/office/word/2018/wordml/cex" xmlns:w16cid="http://schemas.microsoft.com/office/word/2016/wordml/cid" xmlns:w16="http://schemas.microsoft.com/office/word/2018/wordml" xmlns:w16du="http://schemas.microsoft.com/office/word/2023/wordml/word16du" xmlns:w16sdtdh="http://schemas.microsoft.com/office/word/2020/wordml/sdtdatahash" xmlns:w16sdtfl="http://schemas.microsoft.com/office/word/2024/wordml/sdtformatlock" xmlns:w16se="http://schemas.microsoft.com/office/word/2015/wordml/symex" mc:Ignorable="w14 w15 w16se w16cid w16 w16cex w16sdtdh w16sdtfl w16du"/>
 </file>
</xml_diff>

<commit_message>
Update docs: add 4 missing skills to CheatSheet, 2 to Finance Library
CheatSheet (28→31): competitive-landscape-deliverable, ic-memo-pipeline,
market-research-pipeline; boundability was already present
Finance Library (25→27): competitive-landscape-deliverable added; boundability
was already present

Co-Authored-By: Claude Sonnet 4.6 <noreply@anthropic.com>
</commit_message>
<xml_diff>
--- a/docs/Claude_Skill_Library_External (Finance).docx
+++ b/docs/Claude_Skill_Library_External (Finance).docx
@@ -1738,7 +1738,7 @@
         <w:rPr>
           <w:rFonts w:ascii="Wix Madefor Display SemiBold" w:eastAsia="Wix Madefor Display SemiBold" w:hAnsi="Wix Madefor Display SemiBold" w:cs="Wix Madefor Display SemiBold"/>
         </w:rPr>
-        <w:t>25 skills across four layers. Skills marked * have been updated in April 2026.</w:t>
+        <w:t>27 skills across four layers. Skills marked * have been updated in April 2026.</w:t>
       </w:r>
     </w:p>
     <w:p>
@@ -2119,6 +2119,116 @@
                 <w:szCs w:val="15"/>
               </w:rPr>
               <w:t>mckinsey-consultant, writing-style, claim-scrutinizer, red-team, competitive-moat-assessment (L2b), pattern-docx / pattern-investment-pptx</w:t>
+            </w:r>
+          </w:p>
+        </w:tc>
+      </w:tr>
+      <w:tr>
+        <w:tc>
+          <w:tcPr>
+            <w:tcW w:w="1200" w:type="dxa"/>
+            <w:tcBorders>
+              <w:top w:val="single" w:sz="4" w:space="0" w:color="DDDDDD"/>
+              <w:left w:val="single" w:sz="4" w:space="0" w:color="DDDDDD"/>
+              <w:bottom w:val="single" w:sz="4" w:space="0" w:color="DDDDDD"/>
+              <w:right w:val="single" w:sz="4" w:space="0" w:color="DDDDDD"/>
+            </w:tcBorders>
+            <w:shd w:val="clear" w:color="auto" w:fill="F2F2F2"/>
+            <w:tcMar>
+              <w:top w:w="80" w:type="dxa"/>
+              <w:left w:w="120" w:type="dxa"/>
+              <w:bottom w:w="80" w:type="dxa"/>
+              <w:right w:w="120" w:type="dxa"/>
+            </w:tcMar>
+          </w:tcPr>
+          <w:p>
+            <w:r>
+              <w:rPr>
+                <w:sz w:val="15"/>
+                <w:szCs w:val="15"/>
+              </w:rPr>
+              <w:t>4 -- Production</w:t>
+            </w:r>
+          </w:p>
+        </w:tc>
+        <w:tc>
+          <w:tcPr>
+            <w:tcW w:w="2400" w:type="dxa"/>
+            <w:tcBorders>
+              <w:top w:val="single" w:sz="4" w:space="0" w:color="DDDDDD"/>
+              <w:left w:val="single" w:sz="4" w:space="0" w:color="DDDDDD"/>
+              <w:bottom w:val="single" w:sz="4" w:space="0" w:color="DDDDDD"/>
+              <w:right w:val="single" w:sz="4" w:space="0" w:color="DDDDDD"/>
+            </w:tcBorders>
+            <w:shd w:val="clear" w:color="auto" w:fill="F2F2F2"/>
+            <w:tcMar>
+              <w:top w:w="80" w:type="dxa"/>
+              <w:left w:w="120" w:type="dxa"/>
+              <w:bottom w:w="80" w:type="dxa"/>
+              <w:right w:w="120" w:type="dxa"/>
+            </w:tcMar>
+          </w:tcPr>
+          <w:p>
+            <w:r>
+              <w:rPr>
+                <w:sz w:val="15"/>
+                <w:szCs w:val="15"/>
+              </w:rPr>
+              <w:t>competitive-landscape-deliverable</w:t>
+            </w:r>
+          </w:p>
+        </w:tc>
+        <w:tc>
+          <w:tcPr>
+            <w:tcW w:w="4200" w:type="dxa"/>
+            <w:tcBorders>
+              <w:top w:val="single" w:sz="4" w:space="0" w:color="DDDDDD"/>
+              <w:left w:val="single" w:sz="4" w:space="0" w:color="DDDDDD"/>
+              <w:bottom w:val="single" w:sz="4" w:space="0" w:color="DDDDDD"/>
+              <w:right w:val="single" w:sz="4" w:space="0" w:color="DDDDDD"/>
+            </w:tcBorders>
+            <w:shd w:val="clear" w:color="auto" w:fill="F2F2F2"/>
+            <w:tcMar>
+              <w:top w:w="80" w:type="dxa"/>
+              <w:left w:w="120" w:type="dxa"/>
+              <w:bottom w:w="80" w:type="dxa"/>
+              <w:right w:w="120" w:type="dxa"/>
+            </w:tcMar>
+          </w:tcPr>
+          <w:p>
+            <w:r>
+              <w:rPr>
+                <w:sz w:val="15"/>
+                <w:szCs w:val="15"/>
+              </w:rPr>
+              <w:t>Converts a competitive landscape spreadsheet (n8n pipeline output or manual) into a board-ready executive deliverable. Verdict-led layout. Preserves Rating + McKinsey rationale with Pattern brand styling.</w:t>
+            </w:r>
+          </w:p>
+        </w:tc>
+        <w:tc>
+          <w:tcPr>
+            <w:tcW w:w="3000" w:type="dxa"/>
+            <w:tcBorders>
+              <w:top w:val="single" w:sz="4" w:space="0" w:color="DDDDDD"/>
+              <w:left w:val="single" w:sz="4" w:space="0" w:color="DDDDDD"/>
+              <w:bottom w:val="single" w:sz="4" w:space="0" w:color="DDDDDD"/>
+              <w:right w:val="single" w:sz="4" w:space="0" w:color="DDDDDD"/>
+            </w:tcBorders>
+            <w:shd w:val="clear" w:color="auto" w:fill="F2F2F2"/>
+            <w:tcMar>
+              <w:top w:w="80" w:type="dxa"/>
+              <w:left w:w="120" w:type="dxa"/>
+              <w:bottom w:w="80" w:type="dxa"/>
+              <w:right w:w="120" w:type="dxa"/>
+            </w:tcMar>
+          </w:tcPr>
+          <w:p>
+            <w:r>
+              <w:rPr>
+                <w:sz w:val="15"/>
+                <w:szCs w:val="15"/>
+              </w:rPr>
+              <w:t>market-research, competitive-moat-assessment, pattern-docx</w:t>
             </w:r>
           </w:p>
         </w:tc>

</xml_diff>